<commit_message>
Loai bo phan Luu y khi soan KHBD o cuoi file KHBD Tieu hoc theo yeu cau
</commit_message>
<xml_diff>
--- a/KHBD_Tin_học/Lớp_1/Bài_01/KHBD_Tin_hoc_Lớp_1_Bai01_BÀI_1._CHIẾC_MÁY_TÍNH_CỦA_EM.docx
+++ b/KHBD_Tin_học/Lớp_1/Bài_01/KHBD_Tin_hoc_Lớp_1_Bai01_BÀI_1._CHIẾC_MÁY_TÍNH_CỦA_EM.docx
@@ -1161,164 +1161,6 @@
           <w:szCs w:val="26"/>
         </w:rPr>
         <w:t>.................................................................................................................................................................................................................................................................................................................................................................................................................................................................................................................................................................................</w:t>
-      </w:r>
-    </w:p>
-    <w:p>
-      <w:pPr>
-        <w:spacing w:line="360" w:lineRule="auto"/>
-        <w:rPr>
-          <w:b/>
-          <w:bCs/>
-          <w:i/>
-          <w:iCs/>
-          <w:color w:val="000000"/>
-          <w:sz w:val="26"/>
-          <w:szCs w:val="26"/>
-        </w:rPr>
-      </w:pPr>
-      <w:r>
-        <w:rPr>
-          <w:b/>
-          <w:bCs/>
-          <w:i/>
-          <w:iCs/>
-          <w:color w:val="000000"/>
-          <w:sz w:val="26"/>
-          <w:szCs w:val="26"/>
-        </w:rPr>
-        <w:t>* Lưu ý khi soạn kế hoạch bài dạy:</w:t>
-      </w:r>
-    </w:p>
-    <w:p>
-      <w:pPr>
-        <w:spacing w:before="20" w:after="20" w:line="350" w:lineRule="auto"/>
-        <w:ind w:firstLine="630"/>
-        <w:rPr>
-          <w:sz w:val="26"/>
-          <w:szCs w:val="26"/>
-        </w:rPr>
-      </w:pPr>
-      <w:r>
-        <w:rPr>
-          <w:sz w:val="26"/>
-          <w:szCs w:val="26"/>
-        </w:rPr>
-        <w:t xml:space="preserve">- Kế hoạch bài dạy phải đảm bảo các nội dung sau: </w:t>
-      </w:r>
-    </w:p>
-    <w:p>
-      <w:pPr>
-        <w:spacing w:before="20" w:after="20" w:line="350" w:lineRule="auto"/>
-        <w:ind w:firstLine="630"/>
-        <w:rPr>
-          <w:sz w:val="26"/>
-          <w:szCs w:val="26"/>
-        </w:rPr>
-      </w:pPr>
-      <w:r>
-        <w:rPr>
-          <w:sz w:val="26"/>
-          <w:szCs w:val="26"/>
-        </w:rPr>
-        <w:t>+ Font chữ Time New Roman, cỡ chữ 13. Căn chỉnh các lề trên 2cm, lề dưới 2cm, lề trái 2.5 cm, lề phải 1,5cm.</w:t>
-      </w:r>
-    </w:p>
-    <w:p>
-      <w:pPr>
-        <w:spacing w:before="20" w:after="20" w:line="350" w:lineRule="auto"/>
-        <w:ind w:firstLine="630"/>
-        <w:rPr>
-          <w:sz w:val="26"/>
-          <w:szCs w:val="26"/>
-        </w:rPr>
-      </w:pPr>
-      <w:r>
-        <w:rPr>
-          <w:sz w:val="26"/>
-          <w:szCs w:val="26"/>
-        </w:rPr>
-        <w:t>+ Các kế hoạch bài dạy đóng quyển (Đúng chương trình thời khoá biểu).</w:t>
-      </w:r>
-    </w:p>
-    <w:p>
-      <w:pPr>
-        <w:spacing w:before="20" w:after="20" w:line="350" w:lineRule="auto"/>
-        <w:ind w:firstLine="630"/>
-        <w:rPr>
-          <w:sz w:val="26"/>
-          <w:szCs w:val="26"/>
-        </w:rPr>
-      </w:pPr>
-      <w:r>
-        <w:rPr>
-          <w:sz w:val="26"/>
-          <w:szCs w:val="26"/>
-        </w:rPr>
-        <w:t>+ Ghi rõ ngày, tháng, năm, họ tên giáo viên ở trang đầu tiên của mỗi kế hoạch bài dạy (mỗi tiết dạy). Đối với GV chuyên biệt không ghi ngày, tháng mà ghi tuần... từ ngày ... đến ngày....</w:t>
-      </w:r>
-    </w:p>
-    <w:p>
-      <w:pPr>
-        <w:spacing w:before="20" w:after="20" w:line="350" w:lineRule="auto"/>
-        <w:ind w:firstLine="630"/>
-        <w:rPr>
-          <w:sz w:val="26"/>
-          <w:szCs w:val="26"/>
-        </w:rPr>
-      </w:pPr>
-      <w:r>
-        <w:rPr>
-          <w:sz w:val="26"/>
-          <w:szCs w:val="26"/>
-        </w:rPr>
-        <w:t xml:space="preserve">+ Xác định rõ mục tiêu bài dạy và mục tiêu của từng hoạt động. </w:t>
-      </w:r>
-      <w:r>
-        <w:rPr>
-          <w:b/>
-          <w:bCs/>
-          <w:sz w:val="26"/>
-          <w:szCs w:val="26"/>
-        </w:rPr>
-        <w:t xml:space="preserve">Mỗi hoạt động chỉ từ 5 – 7 phút. </w:t>
-      </w:r>
-    </w:p>
-    <w:p>
-      <w:pPr>
-        <w:spacing w:before="20" w:after="20" w:line="350" w:lineRule="auto"/>
-        <w:ind w:firstLine="630"/>
-        <w:rPr>
-          <w:sz w:val="26"/>
-          <w:szCs w:val="26"/>
-        </w:rPr>
-      </w:pPr>
-      <w:r>
-        <w:rPr>
-          <w:sz w:val="26"/>
-          <w:szCs w:val="26"/>
-        </w:rPr>
-        <w:lastRenderedPageBreak/>
-        <w:t>+ Nội dung thể hiện rõ hoạt động của thầy - trò, hình thức tổ chức, nội dung, phương pháp, đồ dùng dạy học, dự kiến thời gian cho từng hoạt động, chốt bài (hoặc chốt hoạt động) bằng hệ thống câu hỏi và nội dung kiến thức,.... Cần đưa câu hỏi hoặc bài tập phát triển năng lực phù hợp với học sinh của lớp.</w:t>
-      </w:r>
-    </w:p>
-    <w:p>
-      <w:pPr>
-        <w:spacing w:line="360" w:lineRule="auto"/>
-        <w:rPr>
-          <w:b/>
-          <w:bCs/>
-          <w:color w:val="000000"/>
-          <w:sz w:val="26"/>
-          <w:szCs w:val="26"/>
-        </w:rPr>
-      </w:pPr>
-      <w:r>
-        <w:rPr>
-          <w:color w:val="000000"/>
-          <w:sz w:val="26"/>
-          <w:szCs w:val="26"/>
-        </w:rPr>
-        <w:t xml:space="preserve"> </w:t>
       </w:r>
     </w:p>
     <w:sectPr>

</xml_diff>